<commit_message>
Portada: curso Servicios Cloud, sección 45104, laboratorio N.º 10, trabajo individual
Co-Authored-By: Claude Opus 5.5 <noreply@anthropic.com>
Claude-Session: https://claude.ai/code/session_01PxwDnLPeJLuyWk1wLPNr1t
</commit_message>
<xml_diff>
--- a/informe/Informe_Laboratorio_Monitoreo_Cloud.docx
+++ b/informe/Informe_Laboratorio_Monitoreo_Cloud.docx
@@ -45,7 +45,7 @@
           <w:b/>
           <w:sz w:val="26"/>
         </w:rPr>
-        <w:t>Curso: Herramientas de Desarrollo Profesional TIC</w:t>
+        <w:t>Curso: Servicios Cloud</w:t>
       </w:r>
     </w:p>
     <w:p>
@@ -61,7 +61,7 @@
           <w:color w:val="2E5597"/>
           <w:sz w:val="26"/>
         </w:rPr>
-        <w:t>INFORME DE LABORATORIO N.º ____</w:t>
+        <w:t>INFORME DE LABORATORIO N.º 10</w:t>
       </w:r>
     </w:p>
     <w:p>
@@ -270,7 +270,7 @@
                 <w:szCs w:val="22"/>
                 <w:lang w:val="en-US" w:eastAsia="en-US" w:bidi="ar-SA"/>
               </w:rPr>
-              <w:t>Otros integrantes</w:t>
+              <w:t>Sección</w:t>
             </w:r>
           </w:p>
         </w:tc>
@@ -299,7 +299,7 @@
                 <w:szCs w:val="22"/>
                 <w:lang w:val="en-US" w:eastAsia="en-US" w:bidi="ar-SA"/>
               </w:rPr>
-              <w:t>______________________________________</w:t>
+              <w:t>45104</w:t>
             </w:r>
           </w:p>
         </w:tc>
@@ -333,7 +333,7 @@
                 <w:szCs w:val="22"/>
                 <w:lang w:val="en-US" w:eastAsia="en-US" w:bidi="ar-SA"/>
               </w:rPr>
-              <w:t>Sección</w:t>
+              <w:t>Equipo</w:t>
             </w:r>
           </w:p>
         </w:tc>
@@ -362,7 +362,7 @@
                 <w:szCs w:val="22"/>
                 <w:lang w:val="en-US" w:eastAsia="en-US" w:bidi="ar-SA"/>
               </w:rPr>
-              <w:t>____________</w:t>
+              <w:t>Trabajo individual</w:t>
             </w:r>
           </w:p>
         </w:tc>
@@ -396,7 +396,7 @@
                 <w:szCs w:val="22"/>
                 <w:lang w:val="en-US" w:eastAsia="en-US" w:bidi="ar-SA"/>
               </w:rPr>
-              <w:t>Equipo</w:t>
+              <w:t>Número de laboratorio</w:t>
             </w:r>
           </w:p>
         </w:tc>
@@ -425,70 +425,7 @@
                 <w:szCs w:val="22"/>
                 <w:lang w:val="en-US" w:eastAsia="en-US" w:bidi="ar-SA"/>
               </w:rPr>
-              <w:t>____________</w:t>
-            </w:r>
-          </w:p>
-        </w:tc>
-      </w:tr>
-      <w:tr>
-        <w:trPr/>
-        <w:tc>
-          <w:tcPr>
-            <w:tcW w:w="4649" w:type="dxa"/>
-            <w:tcBorders/>
-            <w:shd w:color="auto" w:fill="E8EEF7" w:val="clear"/>
-          </w:tcPr>
-          <w:p>
-            <w:pPr>
-              <w:pStyle w:val="Normal"/>
-              <w:widowControl/>
-              <w:spacing w:before="0" w:after="120"/>
-              <w:jc w:val="left"/>
-              <w:rPr>
-                <w:rFonts w:cs=""/>
-                <w:kern w:val="0"/>
-                <w:szCs w:val="22"/>
-                <w:lang w:val="en-US" w:eastAsia="en-US" w:bidi="ar-SA"/>
-              </w:rPr>
-            </w:pPr>
-            <w:r>
-              <w:rPr>
-                <w:rFonts w:cs=""/>
-                <w:b/>
-                <w:kern w:val="0"/>
-                <w:szCs w:val="22"/>
-                <w:lang w:val="en-US" w:eastAsia="en-US" w:bidi="ar-SA"/>
-              </w:rPr>
-              <w:t>Número de laboratorio</w:t>
-            </w:r>
-          </w:p>
-        </w:tc>
-        <w:tc>
-          <w:tcPr>
-            <w:tcW w:w="4648" w:type="dxa"/>
-            <w:tcBorders/>
-          </w:tcPr>
-          <w:p>
-            <w:pPr>
-              <w:pStyle w:val="Normal"/>
-              <w:widowControl/>
-              <w:spacing w:before="0" w:after="120"/>
-              <w:jc w:val="left"/>
-              <w:rPr>
-                <w:rFonts w:cs=""/>
-                <w:kern w:val="0"/>
-                <w:szCs w:val="22"/>
-                <w:lang w:val="en-US" w:eastAsia="en-US" w:bidi="ar-SA"/>
-              </w:rPr>
-            </w:pPr>
-            <w:r>
-              <w:rPr>
-                <w:rFonts w:cs=""/>
-                <w:kern w:val="0"/>
-                <w:szCs w:val="22"/>
-                <w:lang w:val="en-US" w:eastAsia="en-US" w:bidi="ar-SA"/>
-              </w:rPr>
-              <w:t>____</w:t>
+              <w:t>10</w:t>
             </w:r>
           </w:p>
         </w:tc>
@@ -705,7 +642,7 @@
             </w:rPr>
             <w:fldChar w:fldCharType="separate"/>
           </w:r>
-          <w:hyperlink w:anchor="__RefHeading___Toc3972_3424116425">
+          <w:hyperlink w:anchor="__RefHeading___Toc3958_4040047475">
             <w:r>
               <w:rPr>
                 <w:webHidden/>
@@ -726,7 +663,7 @@
             </w:tabs>
             <w:rPr/>
           </w:pPr>
-          <w:hyperlink w:anchor="__RefHeading___Toc3974_3424116425">
+          <w:hyperlink w:anchor="__RefHeading___Toc3960_4040047475">
             <w:r>
               <w:rPr>
                 <w:webHidden/>
@@ -747,7 +684,7 @@
             </w:tabs>
             <w:rPr/>
           </w:pPr>
-          <w:hyperlink w:anchor="__RefHeading___Toc3976_3424116425">
+          <w:hyperlink w:anchor="__RefHeading___Toc3962_4040047475">
             <w:r>
               <w:rPr>
                 <w:webHidden/>
@@ -768,7 +705,7 @@
             </w:tabs>
             <w:rPr/>
           </w:pPr>
-          <w:hyperlink w:anchor="__RefHeading___Toc3978_3424116425">
+          <w:hyperlink w:anchor="__RefHeading___Toc3964_4040047475">
             <w:r>
               <w:rPr>
                 <w:webHidden/>
@@ -789,7 +726,7 @@
             </w:tabs>
             <w:rPr/>
           </w:pPr>
-          <w:hyperlink w:anchor="__RefHeading___Toc3980_3424116425">
+          <w:hyperlink w:anchor="__RefHeading___Toc3966_4040047475">
             <w:r>
               <w:rPr>
                 <w:webHidden/>
@@ -810,7 +747,7 @@
             </w:tabs>
             <w:rPr/>
           </w:pPr>
-          <w:hyperlink w:anchor="__RefHeading___Toc3982_3424116425">
+          <w:hyperlink w:anchor="__RefHeading___Toc3968_4040047475">
             <w:r>
               <w:rPr>
                 <w:webHidden/>
@@ -831,7 +768,7 @@
             </w:tabs>
             <w:rPr/>
           </w:pPr>
-          <w:hyperlink w:anchor="__RefHeading___Toc3984_3424116425">
+          <w:hyperlink w:anchor="__RefHeading___Toc3970_4040047475">
             <w:r>
               <w:rPr>
                 <w:webHidden/>
@@ -852,7 +789,7 @@
             </w:tabs>
             <w:rPr/>
           </w:pPr>
-          <w:hyperlink w:anchor="__RefHeading___Toc3986_3424116425">
+          <w:hyperlink w:anchor="__RefHeading___Toc3972_4040047475">
             <w:r>
               <w:rPr>
                 <w:webHidden/>
@@ -873,7 +810,7 @@
             </w:tabs>
             <w:rPr/>
           </w:pPr>
-          <w:hyperlink w:anchor="__RefHeading___Toc3988_3424116425">
+          <w:hyperlink w:anchor="__RefHeading___Toc3974_4040047475">
             <w:r>
               <w:rPr>
                 <w:webHidden/>
@@ -894,7 +831,7 @@
             </w:tabs>
             <w:rPr/>
           </w:pPr>
-          <w:hyperlink w:anchor="__RefHeading___Toc3990_3424116425">
+          <w:hyperlink w:anchor="__RefHeading___Toc3976_4040047475">
             <w:r>
               <w:rPr>
                 <w:webHidden/>
@@ -915,7 +852,7 @@
             </w:tabs>
             <w:rPr/>
           </w:pPr>
-          <w:hyperlink w:anchor="__RefHeading___Toc3992_3424116425">
+          <w:hyperlink w:anchor="__RefHeading___Toc3978_4040047475">
             <w:r>
               <w:rPr>
                 <w:webHidden/>
@@ -936,7 +873,7 @@
             </w:tabs>
             <w:rPr/>
           </w:pPr>
-          <w:hyperlink w:anchor="__RefHeading___Toc3994_3424116425">
+          <w:hyperlink w:anchor="__RefHeading___Toc3980_4040047475">
             <w:r>
               <w:rPr>
                 <w:webHidden/>
@@ -957,7 +894,7 @@
             </w:tabs>
             <w:rPr/>
           </w:pPr>
-          <w:hyperlink w:anchor="__RefHeading___Toc3996_3424116425">
+          <w:hyperlink w:anchor="__RefHeading___Toc3982_4040047475">
             <w:r>
               <w:rPr>
                 <w:webHidden/>
@@ -978,7 +915,7 @@
             </w:tabs>
             <w:rPr/>
           </w:pPr>
-          <w:hyperlink w:anchor="__RefHeading___Toc3998_3424116425">
+          <w:hyperlink w:anchor="__RefHeading___Toc3984_4040047475">
             <w:r>
               <w:rPr>
                 <w:webHidden/>
@@ -999,7 +936,7 @@
             </w:tabs>
             <w:rPr/>
           </w:pPr>
-          <w:hyperlink w:anchor="__RefHeading___Toc4000_3424116425">
+          <w:hyperlink w:anchor="__RefHeading___Toc3986_4040047475">
             <w:r>
               <w:rPr>
                 <w:webHidden/>
@@ -1020,7 +957,7 @@
             </w:tabs>
             <w:rPr/>
           </w:pPr>
-          <w:hyperlink w:anchor="__RefHeading___Toc4002_3424116425">
+          <w:hyperlink w:anchor="__RefHeading___Toc3988_4040047475">
             <w:r>
               <w:rPr>
                 <w:webHidden/>
@@ -1041,7 +978,7 @@
             </w:tabs>
             <w:rPr/>
           </w:pPr>
-          <w:hyperlink w:anchor="__RefHeading___Toc4004_3424116425">
+          <w:hyperlink w:anchor="__RefHeading___Toc3990_4040047475">
             <w:r>
               <w:rPr>
                 <w:webHidden/>
@@ -1062,7 +999,7 @@
             </w:tabs>
             <w:rPr/>
           </w:pPr>
-          <w:hyperlink w:anchor="__RefHeading___Toc4006_3424116425">
+          <w:hyperlink w:anchor="__RefHeading___Toc3992_4040047475">
             <w:r>
               <w:rPr>
                 <w:webHidden/>
@@ -1083,7 +1020,7 @@
             </w:tabs>
             <w:rPr/>
           </w:pPr>
-          <w:hyperlink w:anchor="__RefHeading___Toc4008_3424116425">
+          <w:hyperlink w:anchor="__RefHeading___Toc3994_4040047475">
             <w:r>
               <w:rPr>
                 <w:webHidden/>
@@ -1104,7 +1041,7 @@
             </w:tabs>
             <w:rPr/>
           </w:pPr>
-          <w:hyperlink w:anchor="__RefHeading___Toc4010_3424116425">
+          <w:hyperlink w:anchor="__RefHeading___Toc3996_4040047475">
             <w:r>
               <w:rPr>
                 <w:webHidden/>
@@ -1125,7 +1062,7 @@
             </w:tabs>
             <w:rPr/>
           </w:pPr>
-          <w:hyperlink w:anchor="__RefHeading___Toc4012_3424116425">
+          <w:hyperlink w:anchor="__RefHeading___Toc3998_4040047475">
             <w:r>
               <w:rPr>
                 <w:webHidden/>
@@ -1146,7 +1083,7 @@
             </w:tabs>
             <w:rPr/>
           </w:pPr>
-          <w:hyperlink w:anchor="__RefHeading___Toc4014_3424116425">
+          <w:hyperlink w:anchor="__RefHeading___Toc4000_4040047475">
             <w:r>
               <w:rPr>
                 <w:webHidden/>
@@ -1167,7 +1104,7 @@
             </w:tabs>
             <w:rPr/>
           </w:pPr>
-          <w:hyperlink w:anchor="__RefHeading___Toc4016_3424116425">
+          <w:hyperlink w:anchor="__RefHeading___Toc4002_4040047475">
             <w:r>
               <w:rPr>
                 <w:webHidden/>
@@ -1188,7 +1125,7 @@
             </w:tabs>
             <w:rPr/>
           </w:pPr>
-          <w:hyperlink w:anchor="__RefHeading___Toc4018_3424116425">
+          <w:hyperlink w:anchor="__RefHeading___Toc4004_4040047475">
             <w:r>
               <w:rPr>
                 <w:webHidden/>
@@ -1209,7 +1146,7 @@
             </w:tabs>
             <w:rPr/>
           </w:pPr>
-          <w:hyperlink w:anchor="__RefHeading___Toc4020_3424116425">
+          <w:hyperlink w:anchor="__RefHeading___Toc4006_4040047475">
             <w:r>
               <w:rPr>
                 <w:webHidden/>
@@ -1230,7 +1167,7 @@
             </w:tabs>
             <w:rPr/>
           </w:pPr>
-          <w:hyperlink w:anchor="__RefHeading___Toc4022_3424116425">
+          <w:hyperlink w:anchor="__RefHeading___Toc4008_4040047475">
             <w:r>
               <w:rPr>
                 <w:webHidden/>
@@ -1251,7 +1188,7 @@
             </w:tabs>
             <w:rPr/>
           </w:pPr>
-          <w:hyperlink w:anchor="__RefHeading___Toc4024_3424116425">
+          <w:hyperlink w:anchor="__RefHeading___Toc4010_4040047475">
             <w:r>
               <w:rPr>
                 <w:webHidden/>
@@ -1272,7 +1209,7 @@
             </w:tabs>
             <w:rPr/>
           </w:pPr>
-          <w:hyperlink w:anchor="__RefHeading___Toc4026_3424116425">
+          <w:hyperlink w:anchor="__RefHeading___Toc4012_4040047475">
             <w:r>
               <w:rPr>
                 <w:webHidden/>
@@ -1293,7 +1230,7 @@
             </w:tabs>
             <w:rPr/>
           </w:pPr>
-          <w:hyperlink w:anchor="__RefHeading___Toc4028_3424116425">
+          <w:hyperlink w:anchor="__RefHeading___Toc4014_4040047475">
             <w:r>
               <w:rPr>
                 <w:webHidden/>
@@ -1314,7 +1251,7 @@
             </w:tabs>
             <w:rPr/>
           </w:pPr>
-          <w:hyperlink w:anchor="__RefHeading___Toc4030_3424116425">
+          <w:hyperlink w:anchor="__RefHeading___Toc4016_4040047475">
             <w:r>
               <w:rPr>
                 <w:webHidden/>
@@ -1335,7 +1272,7 @@
             </w:tabs>
             <w:rPr/>
           </w:pPr>
-          <w:hyperlink w:anchor="__RefHeading___Toc4032_3424116425">
+          <w:hyperlink w:anchor="__RefHeading___Toc4018_4040047475">
             <w:r>
               <w:rPr>
                 <w:webHidden/>
@@ -1356,7 +1293,7 @@
             </w:tabs>
             <w:rPr/>
           </w:pPr>
-          <w:hyperlink w:anchor="__RefHeading___Toc4034_3424116425">
+          <w:hyperlink w:anchor="__RefHeading___Toc4020_4040047475">
             <w:r>
               <w:rPr>
                 <w:webHidden/>
@@ -1377,7 +1314,7 @@
             </w:tabs>
             <w:rPr/>
           </w:pPr>
-          <w:hyperlink w:anchor="__RefHeading___Toc4036_3424116425">
+          <w:hyperlink w:anchor="__RefHeading___Toc4022_4040047475">
             <w:r>
               <w:rPr>
                 <w:webHidden/>
@@ -1398,7 +1335,7 @@
             </w:tabs>
             <w:rPr/>
           </w:pPr>
-          <w:hyperlink w:anchor="__RefHeading___Toc4038_3424116425">
+          <w:hyperlink w:anchor="__RefHeading___Toc4024_4040047475">
             <w:r>
               <w:rPr>
                 <w:webHidden/>
@@ -1419,7 +1356,7 @@
             </w:tabs>
             <w:rPr/>
           </w:pPr>
-          <w:hyperlink w:anchor="__RefHeading___Toc4040_3424116425">
+          <w:hyperlink w:anchor="__RefHeading___Toc4026_4040047475">
             <w:r>
               <w:rPr>
                 <w:webHidden/>
@@ -1440,7 +1377,7 @@
             </w:tabs>
             <w:rPr/>
           </w:pPr>
-          <w:hyperlink w:anchor="__RefHeading___Toc4042_3424116425">
+          <w:hyperlink w:anchor="__RefHeading___Toc4028_4040047475">
             <w:r>
               <w:rPr>
                 <w:webHidden/>
@@ -1461,7 +1398,7 @@
             </w:tabs>
             <w:rPr/>
           </w:pPr>
-          <w:hyperlink w:anchor="__RefHeading___Toc4044_3424116425">
+          <w:hyperlink w:anchor="__RefHeading___Toc4030_4040047475">
             <w:r>
               <w:rPr>
                 <w:webHidden/>
@@ -1482,7 +1419,7 @@
             </w:tabs>
             <w:rPr/>
           </w:pPr>
-          <w:hyperlink w:anchor="__RefHeading___Toc4046_3424116425">
+          <w:hyperlink w:anchor="__RefHeading___Toc4032_4040047475">
             <w:r>
               <w:rPr>
                 <w:webHidden/>
@@ -1530,7 +1467,7 @@
         <w:spacing w:before="0" w:after="120"/>
         <w:rPr/>
       </w:pPr>
-      <w:bookmarkStart w:id="0" w:name="__RefHeading___Toc3972_3424116425"/>
+      <w:bookmarkStart w:id="0" w:name="__RefHeading___Toc3958_4040047475"/>
       <w:bookmarkEnd w:id="0"/>
       <w:r>
         <w:rPr/>
@@ -1555,7 +1492,7 @@
         <w:pStyle w:val="Heading1"/>
         <w:rPr/>
       </w:pPr>
-      <w:bookmarkStart w:id="1" w:name="__RefHeading___Toc3974_3424116425"/>
+      <w:bookmarkStart w:id="1" w:name="__RefHeading___Toc3960_4040047475"/>
       <w:bookmarkEnd w:id="1"/>
       <w:r>
         <w:rPr/>
@@ -1567,7 +1504,7 @@
         <w:pStyle w:val="Heading2"/>
         <w:rPr/>
       </w:pPr>
-      <w:bookmarkStart w:id="2" w:name="__RefHeading___Toc3976_3424116425"/>
+      <w:bookmarkStart w:id="2" w:name="__RefHeading___Toc3962_4040047475"/>
       <w:bookmarkEnd w:id="2"/>
       <w:r>
         <w:rPr/>
@@ -1592,7 +1529,7 @@
         <w:pStyle w:val="Heading2"/>
         <w:rPr/>
       </w:pPr>
-      <w:bookmarkStart w:id="3" w:name="__RefHeading___Toc3978_3424116425"/>
+      <w:bookmarkStart w:id="3" w:name="__RefHeading___Toc3964_4040047475"/>
       <w:bookmarkEnd w:id="3"/>
       <w:r>
         <w:rPr/>
@@ -2085,7 +2022,7 @@
         <w:pStyle w:val="Heading1"/>
         <w:rPr/>
       </w:pPr>
-      <w:bookmarkStart w:id="4" w:name="__RefHeading___Toc3980_3424116425"/>
+      <w:bookmarkStart w:id="4" w:name="__RefHeading___Toc3966_4040047475"/>
       <w:bookmarkEnd w:id="4"/>
       <w:r>
         <w:rPr/>
@@ -3017,7 +2954,7 @@
         <w:pStyle w:val="Heading1"/>
         <w:rPr/>
       </w:pPr>
-      <w:bookmarkStart w:id="5" w:name="__RefHeading___Toc3982_3424116425"/>
+      <w:bookmarkStart w:id="5" w:name="__RefHeading___Toc3968_4040047475"/>
       <w:bookmarkEnd w:id="5"/>
       <w:r>
         <w:rPr/>
@@ -3029,7 +2966,7 @@
         <w:pStyle w:val="Heading2"/>
         <w:rPr/>
       </w:pPr>
-      <w:bookmarkStart w:id="6" w:name="__RefHeading___Toc3984_3424116425"/>
+      <w:bookmarkStart w:id="6" w:name="__RefHeading___Toc3970_4040047475"/>
       <w:bookmarkEnd w:id="6"/>
       <w:r>
         <w:rPr/>
@@ -4121,7 +4058,7 @@
         <w:pStyle w:val="Heading2"/>
         <w:rPr/>
       </w:pPr>
-      <w:bookmarkStart w:id="7" w:name="__RefHeading___Toc3986_3424116425"/>
+      <w:bookmarkStart w:id="7" w:name="__RefHeading___Toc3972_4040047475"/>
       <w:bookmarkEnd w:id="7"/>
       <w:r>
         <w:rPr/>
@@ -4348,7 +4285,7 @@
         <w:pStyle w:val="Heading2"/>
         <w:rPr/>
       </w:pPr>
-      <w:bookmarkStart w:id="8" w:name="__RefHeading___Toc3988_3424116425"/>
+      <w:bookmarkStart w:id="8" w:name="__RefHeading___Toc3974_4040047475"/>
       <w:bookmarkEnd w:id="8"/>
       <w:r>
         <w:rPr/>
@@ -4447,7 +4384,7 @@
         <w:pStyle w:val="Heading1"/>
         <w:rPr/>
       </w:pPr>
-      <w:bookmarkStart w:id="9" w:name="__RefHeading___Toc3990_3424116425"/>
+      <w:bookmarkStart w:id="9" w:name="__RefHeading___Toc3976_4040047475"/>
       <w:bookmarkEnd w:id="9"/>
       <w:r>
         <w:rPr/>
@@ -5925,7 +5862,7 @@
         <w:pStyle w:val="Heading1"/>
         <w:rPr/>
       </w:pPr>
-      <w:bookmarkStart w:id="10" w:name="__RefHeading___Toc3992_3424116425"/>
+      <w:bookmarkStart w:id="10" w:name="__RefHeading___Toc3978_4040047475"/>
       <w:bookmarkEnd w:id="10"/>
       <w:r>
         <w:rPr/>
@@ -5937,7 +5874,7 @@
         <w:pStyle w:val="Heading2"/>
         <w:rPr/>
       </w:pPr>
-      <w:bookmarkStart w:id="11" w:name="__RefHeading___Toc3994_3424116425"/>
+      <w:bookmarkStart w:id="11" w:name="__RefHeading___Toc3980_4040047475"/>
       <w:bookmarkEnd w:id="11"/>
       <w:r>
         <w:rPr/>
@@ -8151,7 +8088,7 @@
         <w:pStyle w:val="Heading2"/>
         <w:rPr/>
       </w:pPr>
-      <w:bookmarkStart w:id="12" w:name="__RefHeading___Toc3996_3424116425"/>
+      <w:bookmarkStart w:id="12" w:name="__RefHeading___Toc3982_4040047475"/>
       <w:bookmarkEnd w:id="12"/>
       <w:r>
         <w:rPr/>
@@ -8400,7 +8337,7 @@
         <w:pStyle w:val="Heading2"/>
         <w:rPr/>
       </w:pPr>
-      <w:bookmarkStart w:id="13" w:name="__RefHeading___Toc3998_3424116425"/>
+      <w:bookmarkStart w:id="13" w:name="__RefHeading___Toc3984_4040047475"/>
       <w:bookmarkEnd w:id="13"/>
       <w:r>
         <w:rPr/>
@@ -11232,7 +11169,7 @@
         <w:pStyle w:val="Heading2"/>
         <w:rPr/>
       </w:pPr>
-      <w:bookmarkStart w:id="14" w:name="__RefHeading___Toc4000_3424116425"/>
+      <w:bookmarkStart w:id="14" w:name="__RefHeading___Toc3986_4040047475"/>
       <w:bookmarkEnd w:id="14"/>
       <w:r>
         <w:rPr/>
@@ -11363,7 +11300,7 @@
         <w:pStyle w:val="Heading2"/>
         <w:rPr/>
       </w:pPr>
-      <w:bookmarkStart w:id="15" w:name="__RefHeading___Toc4002_3424116425"/>
+      <w:bookmarkStart w:id="15" w:name="__RefHeading___Toc3988_4040047475"/>
       <w:bookmarkEnd w:id="15"/>
       <w:r>
         <w:rPr/>
@@ -13343,7 +13280,7 @@
         <w:pStyle w:val="Heading2"/>
         <w:rPr/>
       </w:pPr>
-      <w:bookmarkStart w:id="16" w:name="__RefHeading___Toc4004_3424116425"/>
+      <w:bookmarkStart w:id="16" w:name="__RefHeading___Toc3990_4040047475"/>
       <w:bookmarkEnd w:id="16"/>
       <w:r>
         <w:rPr/>
@@ -15010,7 +14947,7 @@
         <w:pStyle w:val="Heading1"/>
         <w:rPr/>
       </w:pPr>
-      <w:bookmarkStart w:id="17" w:name="__RefHeading___Toc4006_3424116425"/>
+      <w:bookmarkStart w:id="17" w:name="__RefHeading___Toc3992_4040047475"/>
       <w:bookmarkEnd w:id="17"/>
       <w:r>
         <w:rPr/>
@@ -15022,7 +14959,7 @@
         <w:pStyle w:val="Heading2"/>
         <w:rPr/>
       </w:pPr>
-      <w:bookmarkStart w:id="18" w:name="__RefHeading___Toc4008_3424116425"/>
+      <w:bookmarkStart w:id="18" w:name="__RefHeading___Toc3994_4040047475"/>
       <w:bookmarkEnd w:id="18"/>
       <w:r>
         <w:rPr/>
@@ -16176,7 +16113,7 @@
         <w:pStyle w:val="Heading2"/>
         <w:rPr/>
       </w:pPr>
-      <w:bookmarkStart w:id="19" w:name="__RefHeading___Toc4010_3424116425"/>
+      <w:bookmarkStart w:id="19" w:name="__RefHeading___Toc3996_4040047475"/>
       <w:bookmarkEnd w:id="19"/>
       <w:r>
         <w:rPr/>
@@ -17068,7 +17005,7 @@
         <w:pStyle w:val="Heading2"/>
         <w:rPr/>
       </w:pPr>
-      <w:bookmarkStart w:id="20" w:name="__RefHeading___Toc4012_3424116425"/>
+      <w:bookmarkStart w:id="20" w:name="__RefHeading___Toc3998_4040047475"/>
       <w:bookmarkEnd w:id="20"/>
       <w:r>
         <w:rPr/>
@@ -17936,7 +17873,7 @@
         <w:pStyle w:val="Heading2"/>
         <w:rPr/>
       </w:pPr>
-      <w:bookmarkStart w:id="21" w:name="__RefHeading___Toc4014_3424116425"/>
+      <w:bookmarkStart w:id="21" w:name="__RefHeading___Toc4000_4040047475"/>
       <w:bookmarkEnd w:id="21"/>
       <w:r>
         <w:rPr/>
@@ -18024,7 +17961,7 @@
         <w:pStyle w:val="Heading2"/>
         <w:rPr/>
       </w:pPr>
-      <w:bookmarkStart w:id="22" w:name="__RefHeading___Toc4016_3424116425"/>
+      <w:bookmarkStart w:id="22" w:name="__RefHeading___Toc4002_4040047475"/>
       <w:bookmarkEnd w:id="22"/>
       <w:r>
         <w:rPr/>
@@ -18150,7 +18087,7 @@
         <w:pStyle w:val="Heading1"/>
         <w:rPr/>
       </w:pPr>
-      <w:bookmarkStart w:id="23" w:name="__RefHeading___Toc4018_3424116425"/>
+      <w:bookmarkStart w:id="23" w:name="__RefHeading___Toc4004_4040047475"/>
       <w:bookmarkEnd w:id="23"/>
       <w:r>
         <w:rPr/>
@@ -18162,7 +18099,7 @@
         <w:pStyle w:val="Heading2"/>
         <w:rPr/>
       </w:pPr>
-      <w:bookmarkStart w:id="24" w:name="__RefHeading___Toc4020_3424116425"/>
+      <w:bookmarkStart w:id="24" w:name="__RefHeading___Toc4006_4040047475"/>
       <w:bookmarkEnd w:id="24"/>
       <w:r>
         <w:rPr/>
@@ -18250,7 +18187,7 @@
         <w:pStyle w:val="Heading2"/>
         <w:rPr/>
       </w:pPr>
-      <w:bookmarkStart w:id="25" w:name="__RefHeading___Toc4022_3424116425"/>
+      <w:bookmarkStart w:id="25" w:name="__RefHeading___Toc4008_4040047475"/>
       <w:bookmarkEnd w:id="25"/>
       <w:r>
         <w:rPr/>
@@ -18357,7 +18294,7 @@
         <w:pStyle w:val="Heading2"/>
         <w:rPr/>
       </w:pPr>
-      <w:bookmarkStart w:id="26" w:name="__RefHeading___Toc4024_3424116425"/>
+      <w:bookmarkStart w:id="26" w:name="__RefHeading___Toc4010_4040047475"/>
       <w:bookmarkEnd w:id="26"/>
       <w:r>
         <w:rPr/>
@@ -19097,7 +19034,7 @@
         <w:pStyle w:val="Heading2"/>
         <w:rPr/>
       </w:pPr>
-      <w:bookmarkStart w:id="27" w:name="__RefHeading___Toc4026_3424116425"/>
+      <w:bookmarkStart w:id="27" w:name="__RefHeading___Toc4012_4040047475"/>
       <w:bookmarkEnd w:id="27"/>
       <w:r>
         <w:rPr/>
@@ -19192,7 +19129,7 @@
         <w:pStyle w:val="Heading1"/>
         <w:rPr/>
       </w:pPr>
-      <w:bookmarkStart w:id="28" w:name="__RefHeading___Toc4028_3424116425"/>
+      <w:bookmarkStart w:id="28" w:name="__RefHeading___Toc4014_4040047475"/>
       <w:bookmarkEnd w:id="28"/>
       <w:r>
         <w:rPr/>
@@ -19280,7 +19217,7 @@
         <w:pStyle w:val="Heading1"/>
         <w:rPr/>
       </w:pPr>
-      <w:bookmarkStart w:id="29" w:name="__RefHeading___Toc4030_3424116425"/>
+      <w:bookmarkStart w:id="29" w:name="__RefHeading___Toc4016_4040047475"/>
       <w:bookmarkEnd w:id="29"/>
       <w:r>
         <w:rPr/>
@@ -19578,7 +19515,7 @@
         <w:pStyle w:val="Heading1"/>
         <w:rPr/>
       </w:pPr>
-      <w:bookmarkStart w:id="30" w:name="__RefHeading___Toc4032_3424116425"/>
+      <w:bookmarkStart w:id="30" w:name="__RefHeading___Toc4018_4040047475"/>
       <w:bookmarkEnd w:id="30"/>
       <w:r>
         <w:rPr/>
@@ -19708,7 +19645,7 @@
         <w:pStyle w:val="Heading1"/>
         <w:rPr/>
       </w:pPr>
-      <w:bookmarkStart w:id="31" w:name="__RefHeading___Toc4034_3424116425"/>
+      <w:bookmarkStart w:id="31" w:name="__RefHeading___Toc4020_4040047475"/>
       <w:bookmarkEnd w:id="31"/>
       <w:r>
         <w:rPr/>
@@ -20198,7 +20135,7 @@
         <w:pStyle w:val="Heading1"/>
         <w:rPr/>
       </w:pPr>
-      <w:bookmarkStart w:id="32" w:name="__RefHeading___Toc4036_3424116425"/>
+      <w:bookmarkStart w:id="32" w:name="__RefHeading___Toc4022_4040047475"/>
       <w:bookmarkEnd w:id="32"/>
       <w:r>
         <w:rPr/>
@@ -20210,7 +20147,7 @@
         <w:pStyle w:val="Heading2"/>
         <w:rPr/>
       </w:pPr>
-      <w:bookmarkStart w:id="33" w:name="__RefHeading___Toc4038_3424116425"/>
+      <w:bookmarkStart w:id="33" w:name="__RefHeading___Toc4024_4040047475"/>
       <w:bookmarkEnd w:id="33"/>
       <w:r>
         <w:rPr/>
@@ -20443,7 +20380,7 @@
         <w:pStyle w:val="Heading2"/>
         <w:rPr/>
       </w:pPr>
-      <w:bookmarkStart w:id="34" w:name="__RefHeading___Toc4040_3424116425"/>
+      <w:bookmarkStart w:id="34" w:name="__RefHeading___Toc4026_4040047475"/>
       <w:bookmarkEnd w:id="34"/>
       <w:r>
         <w:rPr/>
@@ -20637,7 +20574,7 @@
         <w:pStyle w:val="Heading2"/>
         <w:rPr/>
       </w:pPr>
-      <w:bookmarkStart w:id="35" w:name="__RefHeading___Toc4042_3424116425"/>
+      <w:bookmarkStart w:id="35" w:name="__RefHeading___Toc4028_4040047475"/>
       <w:bookmarkEnd w:id="35"/>
       <w:r>
         <w:rPr/>
@@ -20737,7 +20674,7 @@
         <w:pStyle w:val="Heading2"/>
         <w:rPr/>
       </w:pPr>
-      <w:bookmarkStart w:id="36" w:name="__RefHeading___Toc4044_3424116425"/>
+      <w:bookmarkStart w:id="36" w:name="__RefHeading___Toc4030_4040047475"/>
       <w:bookmarkEnd w:id="36"/>
       <w:r>
         <w:rPr/>
@@ -21543,7 +21480,7 @@
         <w:pStyle w:val="Heading2"/>
         <w:rPr/>
       </w:pPr>
-      <w:bookmarkStart w:id="37" w:name="__RefHeading___Toc4046_3424116425"/>
+      <w:bookmarkStart w:id="37" w:name="__RefHeading___Toc4032_4040047475"/>
       <w:bookmarkEnd w:id="37"/>
       <w:r>
         <w:rPr/>

</xml_diff>